<commit_message>
Tour creation , tool tips for accessability ,Ui redesign , Hashet implementation ,conditions based on hashsets fast lookup, testing
</commit_message>
<xml_diff>
--- a/docs/Low Level Dynamic Hooks.docx
+++ b/docs/Low Level Dynamic Hooks.docx
@@ -38,6 +38,40 @@
       <w:r>
         <w:t xml:space="preserve"> it comfortable for users with an impairment to change keys or create shortcuts to tasks using </w:t>
       </w:r>
+      <w:r>
+        <w:t xml:space="preserve">combinations </w:t>
+      </w:r>
+    </w:p>
+    <w:p>
+      <w:r>
+        <w:t xml:space="preserve">It itself is also an accessibility feature for other features </w:t>
+      </w:r>
+      <w:proofErr w:type="spellStart"/>
+      <w:proofErr w:type="gramStart"/>
+      <w:r>
+        <w:t>eg.</w:t>
+      </w:r>
+      <w:proofErr w:type="spellEnd"/>
+      <w:r>
+        <w:t>,</w:t>
+      </w:r>
+      <w:proofErr w:type="gramEnd"/>
+      <w:r>
+        <w:t xml:space="preserve"> customization control to toggle an </w:t>
+      </w:r>
+      <w:proofErr w:type="spellStart"/>
+      <w:r>
+        <w:t>accessabilty</w:t>
+      </w:r>
+      <w:proofErr w:type="spellEnd"/>
+      <w:r>
+        <w:t xml:space="preserve"> feature on or </w:t>
+      </w:r>
+      <w:proofErr w:type="gramStart"/>
+      <w:r>
+        <w:t>off .</w:t>
+      </w:r>
+      <w:proofErr w:type="gramEnd"/>
     </w:p>
     <w:p>
       <w:r>
@@ -120,108 +154,14 @@
         </w:rPr>
         <w:t xml:space="preserve"> of events</w:t>
       </w:r>
-    </w:p>
-    <w:p/>
-    <w:tbl>
-      <w:tblPr>
-        <w:tblStyle w:val="TableGrid"/>
-        <w:tblW w:w="0" w:type="auto"/>
-        <w:tblLook w:val="04A0" w:firstRow="1" w:lastRow="0" w:firstColumn="1" w:lastColumn="0" w:noHBand="0" w:noVBand="1"/>
-      </w:tblPr>
-      <w:tblGrid>
-        <w:gridCol w:w="535"/>
-        <w:gridCol w:w="5698"/>
-        <w:gridCol w:w="3117"/>
-      </w:tblGrid>
-      <w:tr>
-        <w:tc>
-          <w:tcPr>
-            <w:tcW w:w="535" w:type="dxa"/>
-          </w:tcPr>
-          <w:p/>
-        </w:tc>
-        <w:tc>
-          <w:tcPr>
-            <w:tcW w:w="5698" w:type="dxa"/>
-          </w:tcPr>
-          <w:p>
-            <w:r>
-              <w:t xml:space="preserve">User </w:t>
-            </w:r>
-          </w:p>
-        </w:tc>
-        <w:tc>
-          <w:tcPr>
-            <w:tcW w:w="3117" w:type="dxa"/>
-          </w:tcPr>
-          <w:p/>
-        </w:tc>
-      </w:tr>
-      <w:tr>
-        <w:tc>
-          <w:tcPr>
-            <w:tcW w:w="535" w:type="dxa"/>
-          </w:tcPr>
-          <w:p/>
-        </w:tc>
-        <w:tc>
-          <w:tcPr>
-            <w:tcW w:w="5698" w:type="dxa"/>
-          </w:tcPr>
-          <w:p>
-            <w:r>
-              <w:t xml:space="preserve">User cannot use certain keys </w:t>
-            </w:r>
-          </w:p>
-        </w:tc>
-        <w:tc>
-          <w:tcPr>
-            <w:tcW w:w="3117" w:type="dxa"/>
-          </w:tcPr>
-          <w:p/>
-        </w:tc>
-      </w:tr>
-      <w:tr>
-        <w:tc>
-          <w:tcPr>
-            <w:tcW w:w="535" w:type="dxa"/>
-          </w:tcPr>
-          <w:p/>
-        </w:tc>
-        <w:tc>
-          <w:tcPr>
-            <w:tcW w:w="5698" w:type="dxa"/>
-          </w:tcPr>
-          <w:p/>
-        </w:tc>
-        <w:tc>
-          <w:tcPr>
-            <w:tcW w:w="3117" w:type="dxa"/>
-          </w:tcPr>
-          <w:p/>
-        </w:tc>
-      </w:tr>
-      <w:tr>
-        <w:tc>
-          <w:tcPr>
-            <w:tcW w:w="535" w:type="dxa"/>
-          </w:tcPr>
-          <w:p/>
-        </w:tc>
-        <w:tc>
-          <w:tcPr>
-            <w:tcW w:w="5698" w:type="dxa"/>
-          </w:tcPr>
-          <w:p/>
-        </w:tc>
-        <w:tc>
-          <w:tcPr>
-            <w:tcW w:w="3117" w:type="dxa"/>
-          </w:tcPr>
-          <w:p/>
-        </w:tc>
-      </w:tr>
-    </w:tbl>
+      <w:r>
+        <w:rPr>
+          <w:sz w:val="22"/>
+          <w:szCs w:val="22"/>
+        </w:rPr>
+        <w:t xml:space="preserve"> or actions </w:t>
+      </w:r>
+    </w:p>
     <w:p/>
     <w:p>
       <w:r>
@@ -381,7 +321,7 @@
                     <pic:cNvPicPr/>
                   </pic:nvPicPr>
                   <pic:blipFill>
-                    <a:blip r:embed="rId4"/>
+                    <a:blip r:embed="rId5"/>
                     <a:stretch>
                       <a:fillRect/>
                     </a:stretch>
@@ -428,7 +368,7 @@
                     <pic:cNvPicPr/>
                   </pic:nvPicPr>
                   <pic:blipFill>
-                    <a:blip r:embed="rId5"/>
+                    <a:blip r:embed="rId6"/>
                     <a:stretch>
                       <a:fillRect/>
                     </a:stretch>
@@ -546,76 +486,22 @@
     </w:p>
     <w:p>
       <w:r>
-        <w:t xml:space="preserve">  </w:t>
-      </w:r>
-    </w:p>
-    <w:p>
-      <w:pPr>
-        <w:rPr>
-          <w:sz w:val="18"/>
-          <w:szCs w:val="18"/>
-        </w:rPr>
-      </w:pPr>
-      <w:hyperlink r:id="rId6" w:history="1">
-        <w:r>
-          <w:rPr>
-            <w:rStyle w:val="Hyperlink"/>
-            <w:sz w:val="18"/>
-            <w:szCs w:val="18"/>
-          </w:rPr>
-          <w:t>https://learn.microsoft.com/en-us/windows/win32/procthread/about-processes-and-threads</w:t>
-        </w:r>
-      </w:hyperlink>
-    </w:p>
-    <w:p>
-      <w:pPr>
-        <w:rPr>
-          <w:sz w:val="18"/>
-          <w:szCs w:val="18"/>
-        </w:rPr>
-      </w:pPr>
-    </w:p>
-    <w:p>
-      <w:pPr>
-        <w:rPr>
-          <w:sz w:val="18"/>
-          <w:szCs w:val="18"/>
-        </w:rPr>
-      </w:pPr>
-      <w:hyperlink r:id="rId7" w:history="1">
-        <w:r>
-          <w:rPr>
-            <w:rStyle w:val="Hyperlink"/>
-            <w:sz w:val="18"/>
-            <w:szCs w:val="18"/>
-          </w:rPr>
-          <w:t>https://stackoverflow.com/questions/13001215/detect-if-modifier-key-is-pressed-in-keyroutedeventargs-event</w:t>
-        </w:r>
-      </w:hyperlink>
-    </w:p>
-    <w:p>
-      <w:pPr>
-        <w:rPr>
-          <w:sz w:val="18"/>
-          <w:szCs w:val="18"/>
-        </w:rPr>
-      </w:pPr>
-    </w:p>
-    <w:p>
-      <w:pPr>
-        <w:pStyle w:val="Heading2"/>
-      </w:pPr>
-      <w:r>
-        <w:t>Binary Computation Through OR Logical Gates</w:t>
-      </w:r>
-    </w:p>
-    <w:p/>
+        <w:t xml:space="preserve">You can see here that the state of the virtual key is “down” pressed it uses a logic gate to add the binary of the key so it can be identified later if a possible join of another key is input into the same space in memory. This </w:t>
+      </w:r>
+      <w:proofErr w:type="spellStart"/>
+      <w:r>
+        <w:t>maths</w:t>
+      </w:r>
+      <w:proofErr w:type="spellEnd"/>
+      <w:r>
+        <w:t xml:space="preserve"> is described at the bottom of the page. </w:t>
+      </w:r>
+    </w:p>
     <w:p>
       <w:r>
         <w:rPr>
           <w:noProof/>
         </w:rPr>
-        <w:lastRenderedPageBreak/>
         <w:drawing>
           <wp:inline distT="0" distB="0" distL="0" distR="0" wp14:anchorId="37552926" wp14:editId="59185FA2">
             <wp:extent cx="5915025" cy="390525"/>
@@ -632,7 +518,7 @@
                     <pic:cNvPicPr/>
                   </pic:nvPicPr>
                   <pic:blipFill>
-                    <a:blip r:embed="rId8"/>
+                    <a:blip r:embed="rId7"/>
                     <a:stretch>
                       <a:fillRect/>
                     </a:stretch>
@@ -656,51 +542,33 @@
     <w:p/>
     <w:p>
       <w:r>
+        <w:t xml:space="preserve">The Ui Is updated with the captured keys from the event using </w:t>
+      </w:r>
+      <w:proofErr w:type="spellStart"/>
+      <w:proofErr w:type="gramStart"/>
+      <w:r>
+        <w:t>e.Key</w:t>
+      </w:r>
+      <w:proofErr w:type="spellEnd"/>
+      <w:proofErr w:type="gramEnd"/>
+      <w:r>
+        <w:t xml:space="preserve"> and properly casting back to an unsigned integer. Capturing is quit with a Boolean due to conditional statement allowing input if its </w:t>
+      </w:r>
+      <w:proofErr w:type="gramStart"/>
+      <w:r>
+        <w:t>true .</w:t>
+      </w:r>
+      <w:proofErr w:type="gramEnd"/>
+      <w:r>
+        <w:t xml:space="preserve"> </w:t>
+      </w:r>
+    </w:p>
+    <w:p>
+      <w:r>
         <w:rPr>
           <w:noProof/>
         </w:rPr>
-        <w:drawing>
-          <wp:inline distT="0" distB="0" distL="0" distR="0" wp14:anchorId="708BBA51" wp14:editId="3B77B81A">
-            <wp:extent cx="5695950" cy="495300"/>
-            <wp:effectExtent l="0" t="0" r="0" b="0"/>
-            <wp:docPr id="1266013790" name="Picture 1"/>
-            <wp:cNvGraphicFramePr>
-              <a:graphicFrameLocks xmlns:a="http://schemas.openxmlformats.org/drawingml/2006/main" noChangeAspect="1"/>
-            </wp:cNvGraphicFramePr>
-            <a:graphic xmlns:a="http://schemas.openxmlformats.org/drawingml/2006/main">
-              <a:graphicData uri="http://schemas.openxmlformats.org/drawingml/2006/picture">
-                <pic:pic xmlns:pic="http://schemas.openxmlformats.org/drawingml/2006/picture">
-                  <pic:nvPicPr>
-                    <pic:cNvPr id="1266013790" name=""/>
-                    <pic:cNvPicPr/>
-                  </pic:nvPicPr>
-                  <pic:blipFill>
-                    <a:blip r:embed="rId9"/>
-                    <a:stretch>
-                      <a:fillRect/>
-                    </a:stretch>
-                  </pic:blipFill>
-                  <pic:spPr>
-                    <a:xfrm>
-                      <a:off x="0" y="0"/>
-                      <a:ext cx="5695950" cy="495300"/>
-                    </a:xfrm>
-                    <a:prstGeom prst="rect">
-                      <a:avLst/>
-                    </a:prstGeom>
-                  </pic:spPr>
-                </pic:pic>
-              </a:graphicData>
-            </a:graphic>
-          </wp:inline>
-        </w:drawing>
-      </w:r>
-    </w:p>
-    <w:p>
-      <w:r>
-        <w:rPr>
-          <w:noProof/>
-        </w:rPr>
+        <w:lastRenderedPageBreak/>
         <w:drawing>
           <wp:inline distT="0" distB="0" distL="0" distR="0" wp14:anchorId="2B48FC45" wp14:editId="2A02B830">
             <wp:extent cx="4591050" cy="847725"/>
@@ -717,7 +585,7 @@
                     <pic:cNvPicPr/>
                   </pic:nvPicPr>
                   <pic:blipFill>
-                    <a:blip r:embed="rId10"/>
+                    <a:blip r:embed="rId8"/>
                     <a:stretch>
                       <a:fillRect/>
                     </a:stretch>
@@ -740,140 +608,33 @@
     </w:p>
     <w:p>
       <w:r>
+        <w:t xml:space="preserve">We make sure the hook is naturally set once upon </w:t>
+      </w:r>
+      <w:proofErr w:type="gramStart"/>
+      <w:r>
+        <w:t>initialization</w:t>
+      </w:r>
+      <w:r>
+        <w:t xml:space="preserve"> .</w:t>
+      </w:r>
+      <w:proofErr w:type="gramEnd"/>
+      <w:r>
+        <w:t xml:space="preserve"> Only when the user tries to change the hook code </w:t>
+      </w:r>
+      <w:proofErr w:type="gramStart"/>
+      <w:r>
+        <w:t>will</w:t>
+      </w:r>
+      <w:proofErr w:type="gramEnd"/>
+      <w:r>
+        <w:t xml:space="preserve"> activate. </w:t>
+      </w:r>
+    </w:p>
+    <w:p>
+      <w:r>
         <w:rPr>
           <w:noProof/>
         </w:rPr>
-        <w:drawing>
-          <wp:inline distT="0" distB="0" distL="0" distR="0" wp14:anchorId="61761CA5" wp14:editId="0B35C09C">
-            <wp:extent cx="3505200" cy="733425"/>
-            <wp:effectExtent l="0" t="0" r="0" b="9525"/>
-            <wp:docPr id="1324041598" name="Picture 1"/>
-            <wp:cNvGraphicFramePr>
-              <a:graphicFrameLocks xmlns:a="http://schemas.openxmlformats.org/drawingml/2006/main" noChangeAspect="1"/>
-            </wp:cNvGraphicFramePr>
-            <a:graphic xmlns:a="http://schemas.openxmlformats.org/drawingml/2006/main">
-              <a:graphicData uri="http://schemas.openxmlformats.org/drawingml/2006/picture">
-                <pic:pic xmlns:pic="http://schemas.openxmlformats.org/drawingml/2006/picture">
-                  <pic:nvPicPr>
-                    <pic:cNvPr id="1324041598" name=""/>
-                    <pic:cNvPicPr/>
-                  </pic:nvPicPr>
-                  <pic:blipFill>
-                    <a:blip r:embed="rId11"/>
-                    <a:stretch>
-                      <a:fillRect/>
-                    </a:stretch>
-                  </pic:blipFill>
-                  <pic:spPr>
-                    <a:xfrm>
-                      <a:off x="0" y="0"/>
-                      <a:ext cx="3505200" cy="733425"/>
-                    </a:xfrm>
-                    <a:prstGeom prst="rect">
-                      <a:avLst/>
-                    </a:prstGeom>
-                  </pic:spPr>
-                </pic:pic>
-              </a:graphicData>
-            </a:graphic>
-          </wp:inline>
-        </w:drawing>
-      </w:r>
-    </w:p>
-    <w:p/>
-    <w:p>
-      <w:r>
-        <w:rPr>
-          <w:noProof/>
-        </w:rPr>
-        <w:drawing>
-          <wp:inline distT="0" distB="0" distL="0" distR="0" wp14:anchorId="58204572" wp14:editId="691501C0">
-            <wp:extent cx="2828925" cy="419100"/>
-            <wp:effectExtent l="0" t="0" r="9525" b="0"/>
-            <wp:docPr id="1629667735" name="Picture 1"/>
-            <wp:cNvGraphicFramePr>
-              <a:graphicFrameLocks xmlns:a="http://schemas.openxmlformats.org/drawingml/2006/main" noChangeAspect="1"/>
-            </wp:cNvGraphicFramePr>
-            <a:graphic xmlns:a="http://schemas.openxmlformats.org/drawingml/2006/main">
-              <a:graphicData uri="http://schemas.openxmlformats.org/drawingml/2006/picture">
-                <pic:pic xmlns:pic="http://schemas.openxmlformats.org/drawingml/2006/picture">
-                  <pic:nvPicPr>
-                    <pic:cNvPr id="1629667735" name=""/>
-                    <pic:cNvPicPr/>
-                  </pic:nvPicPr>
-                  <pic:blipFill>
-                    <a:blip r:embed="rId12"/>
-                    <a:stretch>
-                      <a:fillRect/>
-                    </a:stretch>
-                  </pic:blipFill>
-                  <pic:spPr>
-                    <a:xfrm>
-                      <a:off x="0" y="0"/>
-                      <a:ext cx="2828925" cy="419100"/>
-                    </a:xfrm>
-                    <a:prstGeom prst="rect">
-                      <a:avLst/>
-                    </a:prstGeom>
-                  </pic:spPr>
-                </pic:pic>
-              </a:graphicData>
-            </a:graphic>
-          </wp:inline>
-        </w:drawing>
-      </w:r>
-    </w:p>
-    <w:p/>
-    <w:p>
-      <w:r>
-        <w:rPr>
-          <w:noProof/>
-        </w:rPr>
-        <w:drawing>
-          <wp:inline distT="0" distB="0" distL="0" distR="0" wp14:anchorId="60F1CD69" wp14:editId="376219D9">
-            <wp:extent cx="3381375" cy="1371600"/>
-            <wp:effectExtent l="0" t="0" r="9525" b="0"/>
-            <wp:docPr id="303503648" name="Picture 1"/>
-            <wp:cNvGraphicFramePr>
-              <a:graphicFrameLocks xmlns:a="http://schemas.openxmlformats.org/drawingml/2006/main" noChangeAspect="1"/>
-            </wp:cNvGraphicFramePr>
-            <a:graphic xmlns:a="http://schemas.openxmlformats.org/drawingml/2006/main">
-              <a:graphicData uri="http://schemas.openxmlformats.org/drawingml/2006/picture">
-                <pic:pic xmlns:pic="http://schemas.openxmlformats.org/drawingml/2006/picture">
-                  <pic:nvPicPr>
-                    <pic:cNvPr id="303503648" name=""/>
-                    <pic:cNvPicPr/>
-                  </pic:nvPicPr>
-                  <pic:blipFill>
-                    <a:blip r:embed="rId13"/>
-                    <a:stretch>
-                      <a:fillRect/>
-                    </a:stretch>
-                  </pic:blipFill>
-                  <pic:spPr>
-                    <a:xfrm>
-                      <a:off x="0" y="0"/>
-                      <a:ext cx="3381375" cy="1371600"/>
-                    </a:xfrm>
-                    <a:prstGeom prst="rect">
-                      <a:avLst/>
-                    </a:prstGeom>
-                  </pic:spPr>
-                </pic:pic>
-              </a:graphicData>
-            </a:graphic>
-          </wp:inline>
-        </w:drawing>
-      </w:r>
-    </w:p>
-    <w:p/>
-    <w:p/>
-    <w:p>
-      <w:r>
-        <w:rPr>
-          <w:noProof/>
-        </w:rPr>
-        <w:lastRenderedPageBreak/>
         <w:drawing>
           <wp:inline distT="0" distB="0" distL="0" distR="0" wp14:anchorId="1F560506" wp14:editId="420B7A3E">
             <wp:extent cx="5829300" cy="2038350"/>
@@ -890,7 +651,7 @@
                     <pic:cNvPicPr/>
                   </pic:nvPicPr>
                   <pic:blipFill>
-                    <a:blip r:embed="rId14"/>
+                    <a:blip r:embed="rId9"/>
                     <a:stretch>
                       <a:fillRect/>
                     </a:stretch>
@@ -911,7 +672,40 @@
         </w:drawing>
       </w:r>
     </w:p>
-    <w:p/>
+    <w:p>
+      <w:r>
+        <w:t xml:space="preserve">Dynamic linked libraries are </w:t>
+      </w:r>
+      <w:proofErr w:type="gramStart"/>
+      <w:r>
+        <w:t>imported</w:t>
+      </w:r>
+      <w:proofErr w:type="gramEnd"/>
+      <w:r>
+        <w:t xml:space="preserve"> and I follow the parameters to hook into a global input </w:t>
+      </w:r>
+      <w:proofErr w:type="gramStart"/>
+      <w:r>
+        <w:t>stream .</w:t>
+      </w:r>
+      <w:proofErr w:type="gramEnd"/>
+      <w:r>
+        <w:t xml:space="preserve"> This means in this case a </w:t>
+      </w:r>
+      <w:proofErr w:type="gramStart"/>
+      <w:r>
+        <w:t>hotkey</w:t>
+      </w:r>
+      <w:proofErr w:type="gramEnd"/>
+      <w:r>
+        <w:t xml:space="preserve"> of Mod Control or Mod Alt with VK 0 is registered to call certain logic even if the app is </w:t>
+      </w:r>
+      <w:proofErr w:type="gramStart"/>
+      <w:r>
+        <w:t>closed .</w:t>
+      </w:r>
+      <w:proofErr w:type="gramEnd"/>
+    </w:p>
     <w:p>
       <w:r>
         <w:rPr>
@@ -933,7 +727,7 @@
                     <pic:cNvPicPr/>
                   </pic:nvPicPr>
                   <pic:blipFill>
-                    <a:blip r:embed="rId15"/>
+                    <a:blip r:embed="rId10"/>
                     <a:stretch>
                       <a:fillRect/>
                     </a:stretch>
@@ -954,6 +748,7 @@
         </w:drawing>
       </w:r>
     </w:p>
+    <w:p/>
     <w:p>
       <w:r>
         <w:rPr>
@@ -975,7 +770,7 @@
                     <pic:cNvPicPr/>
                   </pic:nvPicPr>
                   <pic:blipFill>
-                    <a:blip r:embed="rId16"/>
+                    <a:blip r:embed="rId11"/>
                     <a:stretch>
                       <a:fillRect/>
                     </a:stretch>
@@ -998,6 +793,7 @@
     </w:p>
     <w:p>
       <w:r>
+        <w:lastRenderedPageBreak/>
         <w:t xml:space="preserve">This null check works due to each binary operation returning false for every key – this would prove the user did not choose dynamically and it is set for </w:t>
       </w:r>
       <w:proofErr w:type="gramStart"/>
@@ -1008,13 +804,8 @@
       <w:r>
         <w:t xml:space="preserve"> If they just did set – </w:t>
       </w:r>
-      <w:proofErr w:type="spellStart"/>
-      <w:r>
-        <w:t>degrister</w:t>
-      </w:r>
-      <w:proofErr w:type="spellEnd"/>
-      <w:r>
-        <w:t xml:space="preserve"> </w:t>
+      <w:r>
+        <w:t xml:space="preserve">then deregister. </w:t>
       </w:r>
     </w:p>
     <w:p>
@@ -1080,186 +871,104 @@
     </w:p>
     <w:p>
       <w:r>
-        <w:lastRenderedPageBreak/>
-        <w:t xml:space="preserve">The user cannot mistakenly destroy background services by clicking as the window disables close but instead </w:t>
-      </w:r>
-    </w:p>
-    <w:p>
-      <w:r>
-        <w:t xml:space="preserve">Hides it </w:t>
-      </w:r>
-      <w:proofErr w:type="gramStart"/>
-      <w:r>
-        <w:t>( by</w:t>
-      </w:r>
-      <w:proofErr w:type="gramEnd"/>
-      <w:r>
-        <w:t xml:space="preserve"> dynamic library window </w:t>
-      </w:r>
-      <w:proofErr w:type="gramStart"/>
-      <w:r>
-        <w:t>positioning )</w:t>
-      </w:r>
-      <w:proofErr w:type="gramEnd"/>
+        <w:t xml:space="preserve">The user cannot mistakenly destroy background services by clicking as the window disables close but instead Is programmed to be a tool widow (hides references in the </w:t>
+      </w:r>
+      <w:proofErr w:type="gramStart"/>
+      <w:r>
+        <w:t>taskbar .</w:t>
+      </w:r>
+      <w:proofErr w:type="gramEnd"/>
+    </w:p>
+    <w:p/>
+    <w:p>
+      <w:pPr>
+        <w:pStyle w:val="Heading4"/>
+      </w:pPr>
+      <w:r>
+        <w:t xml:space="preserve">Binary </w:t>
+      </w:r>
+      <w:r>
+        <w:rPr>
+          <w:rStyle w:val="Heading4Char"/>
+        </w:rPr>
+        <w:t>Logic</w:t>
+      </w:r>
       <w:r>
         <w:t xml:space="preserve"> </w:t>
       </w:r>
     </w:p>
     <w:p>
       <w:r>
-        <w:t xml:space="preserve">has no </w:t>
-      </w:r>
-      <w:proofErr w:type="spellStart"/>
-      <w:proofErr w:type="gramStart"/>
-      <w:r>
-        <w:t>titlebar</w:t>
-      </w:r>
-      <w:proofErr w:type="spellEnd"/>
-      <w:proofErr w:type="gramEnd"/>
-      <w:r>
-        <w:t xml:space="preserve"> controls </w:t>
-      </w:r>
-    </w:p>
-    <w:p>
-      <w:proofErr w:type="gramStart"/>
-      <w:r>
-        <w:t>Is</w:t>
-      </w:r>
-      <w:proofErr w:type="gramEnd"/>
-      <w:r>
-        <w:t xml:space="preserve"> programmed to be a tool widow (hides references in the </w:t>
-      </w:r>
-      <w:proofErr w:type="gramStart"/>
-      <w:r>
-        <w:t>taskbar .</w:t>
-      </w:r>
-      <w:proofErr w:type="gramEnd"/>
+        <w:t xml:space="preserve">This is how bit flags work under the </w:t>
+      </w:r>
+      <w:proofErr w:type="gramStart"/>
+      <w:r>
+        <w:t>hood .</w:t>
+      </w:r>
+      <w:proofErr w:type="gramEnd"/>
+      <w:r>
+        <w:t xml:space="preserve"> This example demonstrate</w:t>
+      </w:r>
+      <w:r>
+        <w:t>s</w:t>
+      </w:r>
+      <w:r>
+        <w:t xml:space="preserve"> how</w:t>
+      </w:r>
+      <w:r>
+        <w:t xml:space="preserve"> </w:t>
+      </w:r>
+      <w:r>
+        <w:t xml:space="preserve">3 = 2 + 4 </w:t>
+      </w:r>
+    </w:p>
+    <w:p>
+      <w:pPr>
+        <w:pStyle w:val="ListParagraph"/>
+        <w:numPr>
+          <w:ilvl w:val="0"/>
+          <w:numId w:val="1"/>
+        </w:numPr>
+      </w:pPr>
+      <w:r>
+        <w:t xml:space="preserve">How to check multiple modifiers in the same binary in memory </w:t>
+      </w:r>
+    </w:p>
+    <w:p>
+      <w:pPr>
+        <w:pStyle w:val="ListParagraph"/>
+        <w:numPr>
+          <w:ilvl w:val="0"/>
+          <w:numId w:val="1"/>
+        </w:numPr>
+      </w:pPr>
+      <w:r>
+        <w:t>How logic gates work</w:t>
+      </w:r>
+    </w:p>
+    <w:p>
+      <w:pPr>
+        <w:pStyle w:val="ListParagraph"/>
+        <w:numPr>
+          <w:ilvl w:val="0"/>
+          <w:numId w:val="1"/>
+        </w:numPr>
+      </w:pPr>
+      <w:r>
+        <w:t>How binary values are computed</w:t>
+      </w:r>
+    </w:p>
+    <w:p>
+      <w:pPr>
+        <w:ind w:left="360"/>
+      </w:pPr>
     </w:p>
     <w:p>
       <w:r>
         <w:rPr>
           <w:noProof/>
         </w:rPr>
-        <w:drawing>
-          <wp:inline distT="0" distB="0" distL="0" distR="0" wp14:anchorId="47925DDE" wp14:editId="5527F785">
-            <wp:extent cx="5629275" cy="600075"/>
-            <wp:effectExtent l="0" t="0" r="9525" b="9525"/>
-            <wp:docPr id="1358421097" name="Picture 1"/>
-            <wp:cNvGraphicFramePr>
-              <a:graphicFrameLocks xmlns:a="http://schemas.openxmlformats.org/drawingml/2006/main" noChangeAspect="1"/>
-            </wp:cNvGraphicFramePr>
-            <a:graphic xmlns:a="http://schemas.openxmlformats.org/drawingml/2006/main">
-              <a:graphicData uri="http://schemas.openxmlformats.org/drawingml/2006/picture">
-                <pic:pic xmlns:pic="http://schemas.openxmlformats.org/drawingml/2006/picture">
-                  <pic:nvPicPr>
-                    <pic:cNvPr id="1358421097" name=""/>
-                    <pic:cNvPicPr/>
-                  </pic:nvPicPr>
-                  <pic:blipFill>
-                    <a:blip r:embed="rId17"/>
-                    <a:stretch>
-                      <a:fillRect/>
-                    </a:stretch>
-                  </pic:blipFill>
-                  <pic:spPr>
-                    <a:xfrm>
-                      <a:off x="0" y="0"/>
-                      <a:ext cx="5629275" cy="600075"/>
-                    </a:xfrm>
-                    <a:prstGeom prst="rect">
-                      <a:avLst/>
-                    </a:prstGeom>
-                  </pic:spPr>
-                </pic:pic>
-              </a:graphicData>
-            </a:graphic>
-          </wp:inline>
-        </w:drawing>
-      </w:r>
-    </w:p>
-    <w:p/>
-    <w:p/>
-    <w:p>
-      <w:r>
-        <w:t xml:space="preserve">Working On </w:t>
-      </w:r>
-      <w:proofErr w:type="gramStart"/>
-      <w:r>
-        <w:t>at the moment</w:t>
-      </w:r>
-      <w:proofErr w:type="gramEnd"/>
-      <w:r>
-        <w:t xml:space="preserve"> </w:t>
-      </w:r>
-    </w:p>
-    <w:p>
-      <w:r>
-        <w:t xml:space="preserve">Since the user would appreciate all changes to their input be </w:t>
-      </w:r>
-      <w:proofErr w:type="spellStart"/>
-      <w:r>
-        <w:t>synchronised</w:t>
-      </w:r>
-      <w:proofErr w:type="spellEnd"/>
-      <w:r>
-        <w:t xml:space="preserve"> across devices then this entails me to make the specific keys passed into the </w:t>
-      </w:r>
-      <w:proofErr w:type="spellStart"/>
-      <w:r>
-        <w:t>SubClass</w:t>
-      </w:r>
-      <w:proofErr w:type="spellEnd"/>
-      <w:r>
-        <w:t xml:space="preserve"> Procedure to be read from a global state </w:t>
-      </w:r>
-      <w:proofErr w:type="gramStart"/>
-      <w:r>
-        <w:t>file .</w:t>
-      </w:r>
-      <w:proofErr w:type="gramEnd"/>
-      <w:r>
-        <w:t xml:space="preserve"> </w:t>
-      </w:r>
-    </w:p>
-    <w:p/>
-    <w:p/>
-    <w:p>
-      <w:r>
-        <w:br w:type="page"/>
-      </w:r>
-    </w:p>
-    <w:p>
-      <w:r>
         <w:lastRenderedPageBreak/>
-        <w:t xml:space="preserve">Binary Logic </w:t>
-      </w:r>
-    </w:p>
-    <w:p>
-      <w:r>
-        <w:t xml:space="preserve">This is how bit flags work under the </w:t>
-      </w:r>
-      <w:proofErr w:type="gramStart"/>
-      <w:r>
-        <w:t>hood .</w:t>
-      </w:r>
-      <w:proofErr w:type="gramEnd"/>
-      <w:r>
-        <w:t xml:space="preserve"> This example </w:t>
-      </w:r>
-      <w:proofErr w:type="gramStart"/>
-      <w:r>
-        <w:t>demonstrate</w:t>
-      </w:r>
-      <w:proofErr w:type="gramEnd"/>
-      <w:r>
-        <w:t xml:space="preserve"> how 3 = 2 + 4 </w:t>
-      </w:r>
-    </w:p>
-    <w:p>
-      <w:r>
-        <w:rPr>
-          <w:noProof/>
-        </w:rPr>
         <w:drawing>
           <wp:inline distT="0" distB="0" distL="0" distR="0" wp14:anchorId="1C231BEF" wp14:editId="5B8773BD">
             <wp:extent cx="3669498" cy="4248150"/>
@@ -1276,7 +985,7 @@
                     <pic:cNvPicPr/>
                   </pic:nvPicPr>
                   <pic:blipFill>
-                    <a:blip r:embed="rId18" cstate="print">
+                    <a:blip r:embed="rId12" cstate="print">
                       <a:extLst>
                         <a:ext uri="{28A0092B-C50C-407E-A947-70E740481C1C}">
                           <a14:useLocalDpi xmlns:a14="http://schemas.microsoft.com/office/drawing/2010/main" val="0"/>
@@ -1311,6 +1020,103 @@
     </w:sectPr>
   </w:body>
 </w:document>
+</file>
+
+<file path=word/numbering.xml><?xml version="1.0" encoding="utf-8"?>
+<w:numbering xmlns:wpc="http://schemas.microsoft.com/office/word/2010/wordprocessingCanvas" xmlns:cx="http://schemas.microsoft.com/office/drawing/2014/chartex" xmlns:cx1="http://schemas.microsoft.com/office/drawing/2015/9/8/chartex" xmlns:cx2="http://schemas.microsoft.com/office/drawing/2015/10/21/chartex" xmlns:cx3="http://schemas.microsoft.com/office/drawing/2016/5/9/chartex" xmlns:cx4="http://schemas.microsoft.com/office/drawing/2016/5/10/chartex" xmlns:cx5="http://schemas.microsoft.com/office/drawing/2016/5/11/chartex" xmlns:cx6="http://schemas.microsoft.com/office/drawing/2016/5/12/chartex" xmlns:cx7="http://schemas.microsoft.com/office/drawing/2016/5/13/chartex" xmlns:cx8="http://schemas.microsoft.com/office/drawing/2016/5/14/chartex" xmlns:mc="http://schemas.openxmlformats.org/markup-compatibility/2006" xmlns:aink="http://schemas.microsoft.com/office/drawing/2016/ink" xmlns:am3d="http://schemas.microsoft.com/office/drawing/2017/model3d" xmlns:o="urn:schemas-microsoft-com:office:office" xmlns:oel="http://schemas.microsoft.com/office/2019/extlst" xmlns:r="http://schemas.openxmlformats.org/officeDocument/2006/relationships" xmlns:m="http://schemas.openxmlformats.org/officeDocument/2006/math" xmlns:v="urn:schemas-microsoft-com:vml" xmlns:wp14="http://schemas.microsoft.com/office/word/2010/wordprocessingDrawing" xmlns:wp="http://schemas.openxmlformats.org/drawingml/2006/wordprocessingDrawing" xmlns:w10="urn:schemas-microsoft-com:office:word" xmlns:w="http://schemas.openxmlformats.org/wordprocessingml/2006/main" xmlns:w14="http://schemas.microsoft.com/office/word/2010/wordml" xmlns:w15="http://schemas.microsoft.com/office/word/2012/wordml" xmlns:w16cex="http://schemas.microsoft.com/office/word/2018/wordml/cex" xmlns:w16cid="http://schemas.microsoft.com/office/word/2016/wordml/cid" xmlns:w16="http://schemas.microsoft.com/office/word/2018/wordml" xmlns:w16du="http://schemas.microsoft.com/office/word/2023/wordml/word16du" xmlns:w16sdtdh="http://schemas.microsoft.com/office/word/2020/wordml/sdtdatahash" xmlns:w16sdtfl="http://schemas.microsoft.com/office/word/2024/wordml/sdtformatlock" xmlns:w16se="http://schemas.microsoft.com/office/word/2015/wordml/symex" xmlns:wpg="http://schemas.microsoft.com/office/word/2010/wordprocessingGroup" xmlns:wpi="http://schemas.microsoft.com/office/word/2010/wordprocessingInk" xmlns:wne="http://schemas.microsoft.com/office/word/2006/wordml" xmlns:wps="http://schemas.microsoft.com/office/word/2010/wordprocessingShape" mc:Ignorable="w14 w15 w16se w16cid w16 w16cex w16sdtdh w16sdtfl w16du wp14">
+  <w:abstractNum w:abstractNumId="0" w15:restartNumberingAfterBreak="0">
+    <w:nsid w:val="37446A43"/>
+    <w:multiLevelType w:val="hybridMultilevel"/>
+    <w:tmpl w:val="ABB8268C"/>
+    <w:lvl w:ilvl="0" w:tplc="0409000F">
+      <w:start w:val="1"/>
+      <w:numFmt w:val="decimal"/>
+      <w:lvlText w:val="%1."/>
+      <w:lvlJc w:val="left"/>
+      <w:pPr>
+        <w:ind w:left="720" w:hanging="360"/>
+      </w:pPr>
+      <w:rPr>
+        <w:rFonts w:hint="default"/>
+      </w:rPr>
+    </w:lvl>
+    <w:lvl w:ilvl="1" w:tplc="04090019" w:tentative="1">
+      <w:start w:val="1"/>
+      <w:numFmt w:val="lowerLetter"/>
+      <w:lvlText w:val="%2."/>
+      <w:lvlJc w:val="left"/>
+      <w:pPr>
+        <w:ind w:left="1440" w:hanging="360"/>
+      </w:pPr>
+    </w:lvl>
+    <w:lvl w:ilvl="2" w:tplc="0409001B" w:tentative="1">
+      <w:start w:val="1"/>
+      <w:numFmt w:val="lowerRoman"/>
+      <w:lvlText w:val="%3."/>
+      <w:lvlJc w:val="right"/>
+      <w:pPr>
+        <w:ind w:left="2160" w:hanging="180"/>
+      </w:pPr>
+    </w:lvl>
+    <w:lvl w:ilvl="3" w:tplc="0409000F" w:tentative="1">
+      <w:start w:val="1"/>
+      <w:numFmt w:val="decimal"/>
+      <w:lvlText w:val="%4."/>
+      <w:lvlJc w:val="left"/>
+      <w:pPr>
+        <w:ind w:left="2880" w:hanging="360"/>
+      </w:pPr>
+    </w:lvl>
+    <w:lvl w:ilvl="4" w:tplc="04090019" w:tentative="1">
+      <w:start w:val="1"/>
+      <w:numFmt w:val="lowerLetter"/>
+      <w:lvlText w:val="%5."/>
+      <w:lvlJc w:val="left"/>
+      <w:pPr>
+        <w:ind w:left="3600" w:hanging="360"/>
+      </w:pPr>
+    </w:lvl>
+    <w:lvl w:ilvl="5" w:tplc="0409001B" w:tentative="1">
+      <w:start w:val="1"/>
+      <w:numFmt w:val="lowerRoman"/>
+      <w:lvlText w:val="%6."/>
+      <w:lvlJc w:val="right"/>
+      <w:pPr>
+        <w:ind w:left="4320" w:hanging="180"/>
+      </w:pPr>
+    </w:lvl>
+    <w:lvl w:ilvl="6" w:tplc="0409000F" w:tentative="1">
+      <w:start w:val="1"/>
+      <w:numFmt w:val="decimal"/>
+      <w:lvlText w:val="%7."/>
+      <w:lvlJc w:val="left"/>
+      <w:pPr>
+        <w:ind w:left="5040" w:hanging="360"/>
+      </w:pPr>
+    </w:lvl>
+    <w:lvl w:ilvl="7" w:tplc="04090019" w:tentative="1">
+      <w:start w:val="1"/>
+      <w:numFmt w:val="lowerLetter"/>
+      <w:lvlText w:val="%8."/>
+      <w:lvlJc w:val="left"/>
+      <w:pPr>
+        <w:ind w:left="5760" w:hanging="360"/>
+      </w:pPr>
+    </w:lvl>
+    <w:lvl w:ilvl="8" w:tplc="0409001B" w:tentative="1">
+      <w:start w:val="1"/>
+      <w:numFmt w:val="lowerRoman"/>
+      <w:lvlText w:val="%9."/>
+      <w:lvlJc w:val="right"/>
+      <w:pPr>
+        <w:ind w:left="6480" w:hanging="180"/>
+      </w:pPr>
+    </w:lvl>
+  </w:abstractNum>
+  <w:num w:numId="1" w16cid:durableId="1678844498">
+    <w:abstractNumId w:val="0"/>
+  </w:num>
+</w:numbering>
 </file>
 
 <file path=word/styles.xml><?xml version="1.0" encoding="utf-8"?>
@@ -1713,6 +1519,7 @@
   <w:style w:type="paragraph" w:default="1" w:styleId="Normal">
     <w:name w:val="Normal"/>
     <w:qFormat/>
+    <w:rsid w:val="006A4CA2"/>
   </w:style>
   <w:style w:type="paragraph" w:styleId="Heading1">
     <w:name w:val="heading 1"/>

</xml_diff>